<commit_message>
Date THUAS teaching and supervision experience 2023 – 2025
Co-Authored-By: Claude Opus 5.5 <noreply@anthropic.com>
Claude-Session: https://claude.ai/code/session_01NjdMuB9buEkMmyf7HkyEWg
</commit_message>
<xml_diff>
--- a/applications/THUAS_Designer_Researcher_Value_Networks/Arunabha_Majumder_Resume_THUAS_Designer_Researcher.docx
+++ b/applications/THUAS_Designer_Researcher_Value_Networks/Arunabha_Majumder_Resume_THUAS_Designer_Researcher.docx
@@ -199,7 +199,7 @@
         <w:t>Teaching and Student Supervision</w:t>
       </w:r>
       <w:r>
-        <w:t xml:space="preserve"> | 2023 – Present</w:t>
+        <w:t xml:space="preserve"> | 2023 – 2025</w:t>
       </w:r>
     </w:p>
     <w:p>
@@ -220,7 +220,7 @@
         <w:spacing w:after="40"/>
       </w:pPr>
       <w:r>
-        <w:t>Teach university students in higher education alongside PhD research.</w:t>
+        <w:t>Taught university students in higher education alongside PhD research.</w:t>
       </w:r>
     </w:p>
     <w:p>
@@ -229,7 +229,7 @@
         <w:spacing w:after="40"/>
       </w:pPr>
       <w:r>
-        <w:t>Supervise Bachelor's (B.Tech) students, guiding them through their work.</w:t>
+        <w:t>Supervised Bachelor's (B.Tech) students, guiding them through their work.</w:t>
       </w:r>
     </w:p>
     <w:p>

</xml_diff>